<commit_message>
Feat: updated all four of the handover documents.
</commit_message>
<xml_diff>
--- a/docs/handover.docx
+++ b/docs/handover.docx
@@ -1988,6 +1988,25 @@
     </w:p>
     <w:bookmarkEnd w:id="20"/>
     <w:bookmarkEnd w:id="21"/>
+    <w:p>
+      <w:pPr>
+        <w:pStyle w:val="Heading2"/>
+      </w:pPr>
+      <w:r>
+        <w:t>Update: PAD Results Syncing</w:t>
+      </w:r>
+    </w:p>
+    <w:p>
+      <w:r>
+        <w:t>After Power Automate Desktop (PAD) completes its run and saves the results to logs/monodas_results.json, you must execute 2_run_sync_results.bat (or run python sync_results.py). This will:</w:t>
+        <w:br/>
+        <w:t>1. Read the eBay Item IDs from monodas_results.json.</w:t>
+        <w:br/>
+        <w:t>2. Update the Google Spreadsheet with these IDs.</w:t>
+        <w:br/>
+        <w:t>3. Automatically delete the monodas_results.json file to prevent interference with future runs.</w:t>
+      </w:r>
+    </w:p>
     <w:sectPr>
       <w:footnotePr>
         <w:numRestart w:val="eachSect"/>

</xml_diff>